<commit_message>
test: cover the VML duplicate in the committed fixture
`duplicate-children.docx` now carries a `<v:roundrect>` that repeats
`<v:stroke>` and `<v:fill>`, so the last bag that could fail a document
is exercised by `tests/parse_test_files.rs` alongside the `w:` ones —
a regression shows up without anyone writing a new test.

Verified as a real guard rather than an assumption: built against
origin/main, converting this fixture fails with

    Parse error: failed to deserialize XML: duplicate field `stroke`

The builder stays deterministic — rebuilt twice, same hash.
</commit_message>
<xml_diff>
--- a/test-files/duplicate-children.docx
+++ b/test-files/duplicate-children.docx
@@ -1,6 +1,6 @@
 
 <file path=word/document.xml><?xml version="1.0" encoding="utf-8"?>
-<w:document xmlns:w="http://schemas.openxmlformats.org/wordprocessingml/2006/main">
+<w:document xmlns:w="http://schemas.openxmlformats.org/wordprocessingml/2006/main" xmlns:v="urn:schemas-microsoft-com:vml">
   <w:body>
     <w:p>
       <w:pPr>
@@ -82,6 +82,18 @@
         <w:t>a style name whose byte 4 splits a codepoint</w:t>
       </w:r>
     </w:p>
+    <w:p>
+      <w:r>
+        <w:pict>
+          <v:roundrect id="rr" style="width:60pt;height:30pt" arcsize="0.2">
+            <v:stroke dashstyle="dot"/>
+            <v:stroke dashstyle="dash"/>
+            <v:fill type="solid" color="#ff0000"/>
+            <v:fill type="solid" color="#0000ff"/>
+          </v:roundrect>
+        </w:pict>
+      </w:r>
+    </w:p>
     <w:sectPr>
       <w:pgSz w:w="11906" w:h="16838"/>
       <w:pgMar w:top="1134" w:right="1134" w:bottom="1134" w:left="1134" w:header="709" w:footer="709" w:gutter="0"/>

</xml_diff>